<commit_message>
Anleitungen: für Pi-OS Trixie überarbeitet wegen neuer Funktionen für Auto-Expand nach first boot.
</commit_message>
<xml_diff>
--- a/anleitungen/pi-ager-basic-install_rev7.docx
+++ b/anleitungen/pi-ager-basic-install_rev7.docx
@@ -142,19 +142,7 @@
         <w:rPr>
           <w:lang w:val="en-US"/>
         </w:rPr>
-        <w:t>B</w:t>
-      </w:r>
-      <w:r>
-        <w:rPr>
-          <w:lang w:val="en-US"/>
-        </w:rPr>
-        <w:t>ookworm</w:t>
-      </w:r>
-      <w:r>
-        <w:rPr>
-          <w:lang w:val="en-US"/>
-        </w:rPr>
-        <w:t>/T</w:t>
+        <w:t>T</w:t>
       </w:r>
       <w:r>
         <w:rPr>
@@ -491,41 +479,69 @@
           <w:lang w:val="en-US"/>
         </w:rPr>
       </w:pPr>
-      <w:r>
-        <w:rPr>
-          <w:lang w:val="en-US"/>
-        </w:rPr>
-        <w:t>Or</w:t>
-      </w:r>
-      <w:r>
-        <w:rPr>
-          <w:lang w:val="en-US"/>
-        </w:rPr>
-        <w:t xml:space="preserve"> select </w:t>
-      </w:r>
-      <w:r>
-        <w:rPr>
-          <w:lang w:val="en-US"/>
-        </w:rPr>
-        <w:t>Pi-OS</w:t>
-      </w:r>
-      <w:r>
-        <w:rPr>
-          <w:lang w:val="en-US"/>
-        </w:rPr>
-        <w:t xml:space="preserve"> 32 Bit</w:t>
-      </w:r>
-      <w:r>
-        <w:rPr>
-          <w:lang w:val="en-US"/>
-        </w:rPr>
-        <w:t xml:space="preserve"> Bookworm</w:t>
-      </w:r>
-      <w:r>
-        <w:rPr>
-          <w:lang w:val="en-US"/>
-        </w:rPr>
-        <w:t>:</w:t>
+    </w:p>
+    <w:p>
+      <w:pPr>
+        <w:pStyle w:val="Listenabsatz"/>
+        <w:rPr>
+          <w:lang w:val="en-US"/>
+        </w:rPr>
+      </w:pPr>
+      <w:r>
+        <w:rPr>
+          <w:lang w:val="en-US"/>
+        </w:rPr>
+        <w:t>Or if you want to in</w:t>
+      </w:r>
+      <w:r>
+        <w:rPr>
+          <w:lang w:val="en-US"/>
+        </w:rPr>
+        <w:t xml:space="preserve">stall pi-ager on Raspberry Pi-5 </w:t>
+      </w:r>
+      <w:r>
+        <w:rPr>
+          <w:lang w:val="en-US"/>
+        </w:rPr>
+        <w:t xml:space="preserve">that needs a 64 Bit PI-OS, </w:t>
+      </w:r>
+      <w:r>
+        <w:rPr>
+          <w:lang w:val="en-US"/>
+        </w:rPr>
+        <w:t>select</w:t>
+      </w:r>
+      <w:r>
+        <w:rPr>
+          <w:lang w:val="en-US"/>
+        </w:rPr>
+        <w:t xml:space="preserve"> Trixie</w:t>
+      </w:r>
+      <w:r>
+        <w:rPr>
+          <w:lang w:val="en-US"/>
+        </w:rPr>
+        <w:t>.</w:t>
+      </w:r>
+    </w:p>
+    <w:p>
+      <w:pPr>
+        <w:pStyle w:val="Listenabsatz"/>
+        <w:rPr>
+          <w:lang w:val="en-US"/>
+        </w:rPr>
+      </w:pPr>
+      <w:r>
+        <w:rPr>
+          <w:lang w:val="en-US"/>
+        </w:rPr>
+        <w:t xml:space="preserve"> Pi-4B, Pi-zero 2W</w:t>
+      </w:r>
+      <w:r>
+        <w:rPr>
+          <w:lang w:val="en-US"/>
+        </w:rPr>
+        <w:t xml:space="preserve"> also can use 64-bit Trixie.</w:t>
       </w:r>
     </w:p>
     <w:p>
@@ -544,7 +560,7 @@
           <wp:inline distT="0" distB="0" distL="0" distR="0">
             <wp:extent cx="5760720" cy="4071620"/>
             <wp:effectExtent l="0" t="0" r="0" b="5080"/>
-            <wp:docPr id="14" name="Grafik 14"/>
+            <wp:docPr id="15" name="Grafik 15"/>
             <wp:cNvGraphicFramePr>
               <a:graphicFrameLocks xmlns:a="http://schemas.openxmlformats.org/drawingml/2006/main" noChangeAspect="1"/>
             </wp:cNvGraphicFramePr>
@@ -552,7 +568,7 @@
               <a:graphicData uri="http://schemas.openxmlformats.org/drawingml/2006/picture">
                 <pic:pic xmlns:pic="http://schemas.openxmlformats.org/drawingml/2006/picture">
                   <pic:nvPicPr>
-                    <pic:cNvPr id="14" name="trixie12.jpg"/>
+                    <pic:cNvPr id="15" name="trixie13.jpg"/>
                     <pic:cNvPicPr/>
                   </pic:nvPicPr>
                   <pic:blipFill>
@@ -606,63 +622,6 @@
           <w:lang w:val="en-US"/>
         </w:rPr>
       </w:pPr>
-      <w:r>
-        <w:rPr>
-          <w:lang w:val="en-US"/>
-        </w:rPr>
-        <w:lastRenderedPageBreak/>
-        <w:t>Or if you want to in</w:t>
-      </w:r>
-      <w:r>
-        <w:rPr>
-          <w:lang w:val="en-US"/>
-        </w:rPr>
-        <w:t xml:space="preserve">stall pi-ager on Raspberry Pi-5 </w:t>
-      </w:r>
-      <w:r>
-        <w:rPr>
-          <w:lang w:val="en-US"/>
-        </w:rPr>
-        <w:t xml:space="preserve">that needs a 64 Bit PI-OS, </w:t>
-      </w:r>
-      <w:r>
-        <w:rPr>
-          <w:lang w:val="en-US"/>
-        </w:rPr>
-        <w:t>select</w:t>
-      </w:r>
-      <w:r>
-        <w:rPr>
-          <w:lang w:val="en-US"/>
-        </w:rPr>
-        <w:t xml:space="preserve"> Trixie</w:t>
-      </w:r>
-      <w:r>
-        <w:rPr>
-          <w:lang w:val="en-US"/>
-        </w:rPr>
-        <w:t>.</w:t>
-      </w:r>
-    </w:p>
-    <w:p>
-      <w:pPr>
-        <w:pStyle w:val="Listenabsatz"/>
-        <w:rPr>
-          <w:lang w:val="en-US"/>
-        </w:rPr>
-      </w:pPr>
-      <w:r>
-        <w:rPr>
-          <w:lang w:val="en-US"/>
-        </w:rPr>
-        <w:t xml:space="preserve"> Pi-4B, Pi-zero 2W</w:t>
-      </w:r>
-      <w:r>
-        <w:rPr>
-          <w:lang w:val="en-US"/>
-        </w:rPr>
-        <w:t xml:space="preserve"> also can use 64-bit Trixie.</w:t>
-      </w:r>
     </w:p>
     <w:p>
       <w:pPr>
@@ -680,7 +639,7 @@
           <wp:inline distT="0" distB="0" distL="0" distR="0">
             <wp:extent cx="5760720" cy="4071620"/>
             <wp:effectExtent l="0" t="0" r="0" b="5080"/>
-            <wp:docPr id="15" name="Grafik 15"/>
+            <wp:docPr id="3" name="Grafik 3"/>
             <wp:cNvGraphicFramePr>
               <a:graphicFrameLocks xmlns:a="http://schemas.openxmlformats.org/drawingml/2006/main" noChangeAspect="1"/>
             </wp:cNvGraphicFramePr>
@@ -688,7 +647,7 @@
               <a:graphicData uri="http://schemas.openxmlformats.org/drawingml/2006/picture">
                 <pic:pic xmlns:pic="http://schemas.openxmlformats.org/drawingml/2006/picture">
                   <pic:nvPicPr>
-                    <pic:cNvPr id="15" name="trixie13.jpg"/>
+                    <pic:cNvPr id="3" name="trixie03.jpg"/>
                     <pic:cNvPicPr/>
                   </pic:nvPicPr>
                   <pic:blipFill>
@@ -742,14 +701,6 @@
           <w:lang w:val="en-US"/>
         </w:rPr>
       </w:pPr>
-    </w:p>
-    <w:p>
-      <w:pPr>
-        <w:pStyle w:val="Listenabsatz"/>
-        <w:rPr>
-          <w:lang w:val="en-US"/>
-        </w:rPr>
-      </w:pPr>
       <w:r>
         <w:rPr>
           <w:noProof/>
@@ -759,7 +710,7 @@
           <wp:inline distT="0" distB="0" distL="0" distR="0">
             <wp:extent cx="5760720" cy="4071620"/>
             <wp:effectExtent l="0" t="0" r="0" b="5080"/>
-            <wp:docPr id="3" name="Grafik 3"/>
+            <wp:docPr id="4" name="Grafik 4"/>
             <wp:cNvGraphicFramePr>
               <a:graphicFrameLocks xmlns:a="http://schemas.openxmlformats.org/drawingml/2006/main" noChangeAspect="1"/>
             </wp:cNvGraphicFramePr>
@@ -767,7 +718,7 @@
               <a:graphicData uri="http://schemas.openxmlformats.org/drawingml/2006/picture">
                 <pic:pic xmlns:pic="http://schemas.openxmlformats.org/drawingml/2006/picture">
                   <pic:nvPicPr>
-                    <pic:cNvPr id="3" name="trixie03.jpg"/>
+                    <pic:cNvPr id="4" name="trixie04.jpg"/>
                     <pic:cNvPicPr/>
                   </pic:nvPicPr>
                   <pic:blipFill>
@@ -830,7 +781,7 @@
           <wp:inline distT="0" distB="0" distL="0" distR="0">
             <wp:extent cx="5760720" cy="4071620"/>
             <wp:effectExtent l="0" t="0" r="0" b="5080"/>
-            <wp:docPr id="4" name="Grafik 4"/>
+            <wp:docPr id="5" name="Grafik 5"/>
             <wp:cNvGraphicFramePr>
               <a:graphicFrameLocks xmlns:a="http://schemas.openxmlformats.org/drawingml/2006/main" noChangeAspect="1"/>
             </wp:cNvGraphicFramePr>
@@ -838,7 +789,7 @@
               <a:graphicData uri="http://schemas.openxmlformats.org/drawingml/2006/picture">
                 <pic:pic xmlns:pic="http://schemas.openxmlformats.org/drawingml/2006/picture">
                   <pic:nvPicPr>
-                    <pic:cNvPr id="4" name="trixie04.jpg"/>
+                    <pic:cNvPr id="5" name="trixie05.jpg"/>
                     <pic:cNvPicPr/>
                   </pic:nvPicPr>
                   <pic:blipFill>
@@ -901,7 +852,7 @@
           <wp:inline distT="0" distB="0" distL="0" distR="0">
             <wp:extent cx="5760720" cy="4071620"/>
             <wp:effectExtent l="0" t="0" r="0" b="5080"/>
-            <wp:docPr id="5" name="Grafik 5"/>
+            <wp:docPr id="7" name="Grafik 7"/>
             <wp:cNvGraphicFramePr>
               <a:graphicFrameLocks xmlns:a="http://schemas.openxmlformats.org/drawingml/2006/main" noChangeAspect="1"/>
             </wp:cNvGraphicFramePr>
@@ -909,7 +860,7 @@
               <a:graphicData uri="http://schemas.openxmlformats.org/drawingml/2006/picture">
                 <pic:pic xmlns:pic="http://schemas.openxmlformats.org/drawingml/2006/picture">
                   <pic:nvPicPr>
-                    <pic:cNvPr id="5" name="trixie05.jpg"/>
+                    <pic:cNvPr id="7" name="trixie06.jpg"/>
                     <pic:cNvPicPr/>
                   </pic:nvPicPr>
                   <pic:blipFill>
@@ -972,7 +923,7 @@
           <wp:inline distT="0" distB="0" distL="0" distR="0">
             <wp:extent cx="5760720" cy="4071620"/>
             <wp:effectExtent l="0" t="0" r="0" b="5080"/>
-            <wp:docPr id="7" name="Grafik 7"/>
+            <wp:docPr id="9" name="Grafik 9"/>
             <wp:cNvGraphicFramePr>
               <a:graphicFrameLocks xmlns:a="http://schemas.openxmlformats.org/drawingml/2006/main" noChangeAspect="1"/>
             </wp:cNvGraphicFramePr>
@@ -980,7 +931,7 @@
               <a:graphicData uri="http://schemas.openxmlformats.org/drawingml/2006/picture">
                 <pic:pic xmlns:pic="http://schemas.openxmlformats.org/drawingml/2006/picture">
                   <pic:nvPicPr>
-                    <pic:cNvPr id="7" name="trixie06.jpg"/>
+                    <pic:cNvPr id="9" name="trixie07.jpg"/>
                     <pic:cNvPicPr/>
                   </pic:nvPicPr>
                   <pic:blipFill>
@@ -1043,7 +994,7 @@
           <wp:inline distT="0" distB="0" distL="0" distR="0">
             <wp:extent cx="5760720" cy="4071620"/>
             <wp:effectExtent l="0" t="0" r="0" b="5080"/>
-            <wp:docPr id="9" name="Grafik 9"/>
+            <wp:docPr id="10" name="Grafik 10"/>
             <wp:cNvGraphicFramePr>
               <a:graphicFrameLocks xmlns:a="http://schemas.openxmlformats.org/drawingml/2006/main" noChangeAspect="1"/>
             </wp:cNvGraphicFramePr>
@@ -1051,7 +1002,7 @@
               <a:graphicData uri="http://schemas.openxmlformats.org/drawingml/2006/picture">
                 <pic:pic xmlns:pic="http://schemas.openxmlformats.org/drawingml/2006/picture">
                   <pic:nvPicPr>
-                    <pic:cNvPr id="9" name="trixie07.jpg"/>
+                    <pic:cNvPr id="10" name="trixie08.jpg"/>
                     <pic:cNvPicPr/>
                   </pic:nvPicPr>
                   <pic:blipFill>
@@ -1115,7 +1066,7 @@
           <wp:inline distT="0" distB="0" distL="0" distR="0">
             <wp:extent cx="5760720" cy="4071620"/>
             <wp:effectExtent l="0" t="0" r="0" b="5080"/>
-            <wp:docPr id="10" name="Grafik 10"/>
+            <wp:docPr id="11" name="Grafik 11"/>
             <wp:cNvGraphicFramePr>
               <a:graphicFrameLocks xmlns:a="http://schemas.openxmlformats.org/drawingml/2006/main" noChangeAspect="1"/>
             </wp:cNvGraphicFramePr>
@@ -1123,7 +1074,7 @@
               <a:graphicData uri="http://schemas.openxmlformats.org/drawingml/2006/picture">
                 <pic:pic xmlns:pic="http://schemas.openxmlformats.org/drawingml/2006/picture">
                   <pic:nvPicPr>
-                    <pic:cNvPr id="10" name="trixie08.jpg"/>
+                    <pic:cNvPr id="11" name="trixie09.jpg"/>
                     <pic:cNvPicPr/>
                   </pic:nvPicPr>
                   <pic:blipFill>
@@ -1186,7 +1137,7 @@
           <wp:inline distT="0" distB="0" distL="0" distR="0">
             <wp:extent cx="5760720" cy="4071620"/>
             <wp:effectExtent l="0" t="0" r="0" b="5080"/>
-            <wp:docPr id="11" name="Grafik 11"/>
+            <wp:docPr id="12" name="Grafik 12"/>
             <wp:cNvGraphicFramePr>
               <a:graphicFrameLocks xmlns:a="http://schemas.openxmlformats.org/drawingml/2006/main" noChangeAspect="1"/>
             </wp:cNvGraphicFramePr>
@@ -1194,7 +1145,7 @@
               <a:graphicData uri="http://schemas.openxmlformats.org/drawingml/2006/picture">
                 <pic:pic xmlns:pic="http://schemas.openxmlformats.org/drawingml/2006/picture">
                   <pic:nvPicPr>
-                    <pic:cNvPr id="11" name="trixie09.jpg"/>
+                    <pic:cNvPr id="12" name="trixie10.jpg"/>
                     <pic:cNvPicPr/>
                   </pic:nvPicPr>
                   <pic:blipFill>
@@ -1258,7 +1209,7 @@
           <wp:inline distT="0" distB="0" distL="0" distR="0">
             <wp:extent cx="5760720" cy="4071620"/>
             <wp:effectExtent l="0" t="0" r="0" b="5080"/>
-            <wp:docPr id="12" name="Grafik 12"/>
+            <wp:docPr id="13" name="Grafik 13"/>
             <wp:cNvGraphicFramePr>
               <a:graphicFrameLocks xmlns:a="http://schemas.openxmlformats.org/drawingml/2006/main" noChangeAspect="1"/>
             </wp:cNvGraphicFramePr>
@@ -1266,7 +1217,7 @@
               <a:graphicData uri="http://schemas.openxmlformats.org/drawingml/2006/picture">
                 <pic:pic xmlns:pic="http://schemas.openxmlformats.org/drawingml/2006/picture">
                   <pic:nvPicPr>
-                    <pic:cNvPr id="12" name="trixie10.jpg"/>
+                    <pic:cNvPr id="13" name="trixie11.jpg"/>
                     <pic:cNvPicPr/>
                   </pic:nvPicPr>
                   <pic:blipFill>
@@ -1320,90 +1271,18 @@
           <w:lang w:val="en-US"/>
         </w:rPr>
       </w:pPr>
-      <w:r>
-        <w:rPr>
-          <w:noProof/>
-          <w:lang w:eastAsia="de-DE"/>
-        </w:rPr>
-        <w:drawing>
-          <wp:inline distT="0" distB="0" distL="0" distR="0">
-            <wp:extent cx="5760720" cy="4071620"/>
-            <wp:effectExtent l="0" t="0" r="0" b="5080"/>
-            <wp:docPr id="13" name="Grafik 13"/>
-            <wp:cNvGraphicFramePr>
-              <a:graphicFrameLocks xmlns:a="http://schemas.openxmlformats.org/drawingml/2006/main" noChangeAspect="1"/>
-            </wp:cNvGraphicFramePr>
-            <a:graphic xmlns:a="http://schemas.openxmlformats.org/drawingml/2006/main">
-              <a:graphicData uri="http://schemas.openxmlformats.org/drawingml/2006/picture">
-                <pic:pic xmlns:pic="http://schemas.openxmlformats.org/drawingml/2006/picture">
-                  <pic:nvPicPr>
-                    <pic:cNvPr id="13" name="trixie11.jpg"/>
-                    <pic:cNvPicPr/>
-                  </pic:nvPicPr>
-                  <pic:blipFill>
-                    <a:blip r:embed="rId18">
-                      <a:extLst>
-                        <a:ext uri="{28A0092B-C50C-407E-A947-70E740481C1C}">
-                          <a14:useLocalDpi xmlns:a14="http://schemas.microsoft.com/office/drawing/2010/main" val="0"/>
-                        </a:ext>
-                      </a:extLst>
-                    </a:blip>
-                    <a:stretch>
-                      <a:fillRect/>
-                    </a:stretch>
-                  </pic:blipFill>
-                  <pic:spPr>
-                    <a:xfrm>
-                      <a:off x="0" y="0"/>
-                      <a:ext cx="5760720" cy="4071620"/>
-                    </a:xfrm>
-                    <a:prstGeom prst="rect">
-                      <a:avLst/>
-                    </a:prstGeom>
-                  </pic:spPr>
-                </pic:pic>
-              </a:graphicData>
-            </a:graphic>
-          </wp:inline>
-        </w:drawing>
-      </w:r>
-    </w:p>
-    <w:p>
-      <w:pPr>
-        <w:pStyle w:val="Listenabsatz"/>
-        <w:rPr>
-          <w:lang w:val="en-US"/>
-        </w:rPr>
-      </w:pPr>
-    </w:p>
-    <w:p>
-      <w:pPr>
-        <w:pStyle w:val="Listenabsatz"/>
-        <w:rPr>
-          <w:lang w:val="en-US"/>
-        </w:rPr>
-      </w:pPr>
-    </w:p>
-    <w:p>
-      <w:pPr>
-        <w:pStyle w:val="Listenabsatz"/>
-        <w:rPr>
-          <w:lang w:val="en-US"/>
-        </w:rPr>
-      </w:pPr>
-    </w:p>
-    <w:p>
-      <w:pPr>
-        <w:pStyle w:val="Listenabsatz"/>
-        <w:rPr>
-          <w:lang w:val="en-US"/>
-        </w:rPr>
-      </w:pPr>
-      <w:r>
-        <w:rPr>
-          <w:lang w:val="en-US"/>
-        </w:rPr>
-        <w:lastRenderedPageBreak/>
+    </w:p>
+    <w:p>
+      <w:pPr>
+        <w:pStyle w:val="Listenabsatz"/>
+        <w:rPr>
+          <w:lang w:val="en-US"/>
+        </w:rPr>
+      </w:pPr>
+      <w:r>
+        <w:rPr>
+          <w:lang w:val="en-US"/>
+        </w:rPr>
         <w:t>Put your SD-Card in your Raspberry Pi and power on your Pi device.</w:t>
       </w:r>
     </w:p>
@@ -1496,7 +1375,7 @@
         </w:rPr>
         <w:t xml:space="preserve"> from </w:t>
       </w:r>
-      <w:hyperlink r:id="rId19" w:history="1">
+      <w:hyperlink r:id="rId18" w:history="1">
         <w:r>
           <w:rPr>
             <w:rStyle w:val="Hyperlink"/>
@@ -1545,7 +1424,7 @@
         </w:rPr>
         <w:t xml:space="preserve"> from </w:t>
       </w:r>
-      <w:hyperlink r:id="rId20" w:history="1">
+      <w:hyperlink r:id="rId19" w:history="1">
         <w:r>
           <w:rPr>
             <w:rStyle w:val="Hyperlink"/>
@@ -1614,6 +1493,7 @@
         <w:rPr>
           <w:lang w:val="en-US"/>
         </w:rPr>
+        <w:lastRenderedPageBreak/>
         <w:pict>
           <v:shapetype id="_x0000_t75" coordsize="21600,21600" o:spt="75" o:preferrelative="t" path="m@4@5l@4@11@9@11@9@5xe" filled="f" stroked="f">
             <v:stroke joinstyle="miter"/>
@@ -1635,7 +1515,7 @@
             <o:lock v:ext="edit" aspectratio="t"/>
           </v:shapetype>
           <v:shape id="_x0000_i1025" type="#_x0000_t75" style="width:339pt;height:331.5pt">
-            <v:imagedata r:id="rId21" o:title="putty1"/>
+            <v:imagedata r:id="rId20" o:title="putty1"/>
           </v:shape>
         </w:pict>
       </w:r>
@@ -1659,10 +1539,9 @@
         <w:rPr>
           <w:lang w:val="en-US"/>
         </w:rPr>
-        <w:lastRenderedPageBreak/>
         <w:pict>
           <v:shape id="_x0000_i1026" type="#_x0000_t75" style="width:453.75pt;height:258.75pt">
-            <v:imagedata r:id="rId22" o:title="putty2"/>
+            <v:imagedata r:id="rId21" o:title="putty2"/>
           </v:shape>
         </w:pict>
       </w:r>
@@ -1846,6 +1725,7 @@
           <w:color w:val="FF0000"/>
           <w:lang w:val="en-US"/>
         </w:rPr>
+        <w:lastRenderedPageBreak/>
         <w:t>wget</w:t>
       </w:r>
       <w:proofErr w:type="spellEnd"/>
@@ -1901,473 +1781,460 @@
         </w:rPr>
         <w:t>leitungen/setup-wifi-ap</w:t>
       </w:r>
+      <w:r>
+        <w:rPr>
+          <w:rStyle w:val="Hyperlink"/>
+          <w:lang w:val="en-US"/>
+        </w:rPr>
+        <w:t>.sh</w:t>
+      </w:r>
+    </w:p>
+    <w:p>
+      <w:pPr>
+        <w:pStyle w:val="Listenabsatz"/>
+        <w:rPr>
+          <w:lang w:val="en-US"/>
+        </w:rPr>
+      </w:pPr>
+    </w:p>
+    <w:p>
+      <w:pPr>
+        <w:pStyle w:val="Listenabsatz"/>
+        <w:rPr>
+          <w:lang w:val="en-US"/>
+        </w:rPr>
+      </w:pPr>
+    </w:p>
+    <w:p>
+      <w:pPr>
+        <w:pStyle w:val="Listenabsatz"/>
+        <w:rPr>
+          <w:color w:val="FF0000"/>
+          <w:lang w:val="en-US"/>
+        </w:rPr>
+      </w:pPr>
+      <w:proofErr w:type="spellStart"/>
+      <w:proofErr w:type="gramStart"/>
+      <w:r>
+        <w:rPr>
+          <w:color w:val="FF0000"/>
+          <w:lang w:val="en-US"/>
+        </w:rPr>
+        <w:t>chmod</w:t>
+      </w:r>
+      <w:proofErr w:type="spellEnd"/>
+      <w:proofErr w:type="gramEnd"/>
+      <w:r>
+        <w:rPr>
+          <w:color w:val="FF0000"/>
+          <w:lang w:val="en-US"/>
+        </w:rPr>
+        <w:t xml:space="preserve"> +x *.</w:t>
+      </w:r>
+      <w:proofErr w:type="spellStart"/>
+      <w:r>
+        <w:rPr>
+          <w:color w:val="FF0000"/>
+          <w:lang w:val="en-US"/>
+        </w:rPr>
+        <w:t>sh</w:t>
+      </w:r>
+      <w:proofErr w:type="spellEnd"/>
+    </w:p>
+    <w:p>
+      <w:pPr>
+        <w:pStyle w:val="Listenabsatz"/>
+        <w:rPr>
+          <w:lang w:val="en-US"/>
+        </w:rPr>
+      </w:pPr>
+    </w:p>
+    <w:p>
+      <w:pPr>
+        <w:pStyle w:val="Listenabsatz"/>
+        <w:rPr>
+          <w:lang w:val="en-US"/>
+        </w:rPr>
+      </w:pPr>
+      <w:r>
+        <w:rPr>
+          <w:lang w:val="en-US"/>
+        </w:rPr>
+        <w:t>Start now first phase of Pi-Ager System setup:</w:t>
+      </w:r>
+    </w:p>
+    <w:p>
+      <w:pPr>
+        <w:pStyle w:val="Listenabsatz"/>
+        <w:rPr>
+          <w:color w:val="FF0000"/>
+          <w:lang w:val="en-US"/>
+        </w:rPr>
+      </w:pPr>
+      <w:proofErr w:type="spellStart"/>
+      <w:proofErr w:type="gramStart"/>
+      <w:r>
+        <w:rPr>
+          <w:color w:val="FF0000"/>
+          <w:lang w:val="en-US"/>
+        </w:rPr>
+        <w:t>sudo</w:t>
+      </w:r>
+      <w:proofErr w:type="spellEnd"/>
+      <w:proofErr w:type="gramEnd"/>
+      <w:r>
+        <w:rPr>
+          <w:color w:val="FF0000"/>
+          <w:lang w:val="en-US"/>
+        </w:rPr>
+        <w:t xml:space="preserve"> ./pi-ager-build-system.sh</w:t>
+      </w:r>
+    </w:p>
+    <w:p>
+      <w:pPr>
+        <w:pStyle w:val="Listenabsatz"/>
+        <w:rPr>
+          <w:color w:val="FF0000"/>
+          <w:lang w:val="en-US"/>
+        </w:rPr>
+      </w:pPr>
+    </w:p>
+    <w:p>
+      <w:pPr>
+        <w:pStyle w:val="Listenabsatz"/>
+        <w:rPr>
+          <w:lang w:val="en-US"/>
+        </w:rPr>
+      </w:pPr>
+      <w:r>
+        <w:rPr>
+          <w:lang w:val="en-US"/>
+        </w:rPr>
+        <w:t xml:space="preserve">You can now follow the system </w:t>
+      </w:r>
+      <w:proofErr w:type="gramStart"/>
+      <w:r>
+        <w:rPr>
+          <w:lang w:val="en-US"/>
+        </w:rPr>
+        <w:t>setup, that</w:t>
+      </w:r>
+      <w:proofErr w:type="gramEnd"/>
+      <w:r>
+        <w:rPr>
+          <w:lang w:val="en-US"/>
+        </w:rPr>
+        <w:t xml:space="preserve"> is divided in </w:t>
+      </w:r>
+      <w:r>
+        <w:rPr>
+          <w:lang w:val="en-US"/>
+        </w:rPr>
+        <w:t>3</w:t>
+      </w:r>
+      <w:r>
+        <w:rPr>
+          <w:lang w:val="en-US"/>
+        </w:rPr>
+        <w:t xml:space="preserve"> steps with rebooting between </w:t>
+      </w:r>
+      <w:r>
+        <w:rPr>
+          <w:lang w:val="en-US"/>
+        </w:rPr>
+        <w:t>the steps</w:t>
+      </w:r>
+      <w:r>
+        <w:rPr>
+          <w:lang w:val="en-US"/>
+        </w:rPr>
+        <w:t>. Restart</w:t>
+      </w:r>
+      <w:r>
+        <w:rPr>
+          <w:lang w:val="en-US"/>
+        </w:rPr>
+        <w:t xml:space="preserve"> the script </w:t>
+      </w:r>
+      <w:r>
+        <w:rPr>
+          <w:lang w:val="en-US"/>
+        </w:rPr>
+        <w:t xml:space="preserve">after rebooting to continue the system </w:t>
+      </w:r>
+      <w:proofErr w:type="gramStart"/>
+      <w:r>
+        <w:rPr>
+          <w:lang w:val="en-US"/>
+        </w:rPr>
+        <w:t>setup</w:t>
+      </w:r>
+      <w:r>
+        <w:rPr>
+          <w:lang w:val="en-US"/>
+        </w:rPr>
+        <w:t xml:space="preserve"> :</w:t>
+      </w:r>
+      <w:proofErr w:type="gramEnd"/>
+    </w:p>
+    <w:p>
+      <w:pPr>
+        <w:pStyle w:val="Listenabsatz"/>
+        <w:rPr>
+          <w:lang w:val="en-US"/>
+        </w:rPr>
+      </w:pPr>
+    </w:p>
+    <w:p>
+      <w:pPr>
+        <w:pStyle w:val="Listenabsatz"/>
+        <w:rPr>
+          <w:lang w:val="en-US"/>
+        </w:rPr>
+      </w:pPr>
+      <w:proofErr w:type="spellStart"/>
+      <w:proofErr w:type="gramStart"/>
+      <w:r>
+        <w:rPr>
+          <w:color w:val="FF0000"/>
+          <w:lang w:val="en-US"/>
+        </w:rPr>
+        <w:t>sudo</w:t>
+      </w:r>
+      <w:proofErr w:type="spellEnd"/>
+      <w:proofErr w:type="gramEnd"/>
+      <w:r>
+        <w:rPr>
+          <w:color w:val="FF0000"/>
+          <w:lang w:val="en-US"/>
+        </w:rPr>
+        <w:t xml:space="preserve"> ./pi-ager-build-system.sh</w:t>
+      </w:r>
+    </w:p>
+    <w:p>
+      <w:pPr>
+        <w:pStyle w:val="Listenabsatz"/>
+        <w:rPr>
+          <w:lang w:val="en-US"/>
+        </w:rPr>
+      </w:pPr>
+    </w:p>
+    <w:p>
+      <w:pPr>
+        <w:pStyle w:val="Listenabsatz"/>
+        <w:rPr>
+          <w:lang w:val="en-US"/>
+        </w:rPr>
+      </w:pPr>
+      <w:r>
+        <w:rPr>
+          <w:lang w:val="en-US"/>
+        </w:rPr>
+        <w:t xml:space="preserve">After step </w:t>
+      </w:r>
+      <w:r>
+        <w:rPr>
+          <w:lang w:val="en-US"/>
+        </w:rPr>
+        <w:t>2</w:t>
+      </w:r>
+      <w:r>
+        <w:rPr>
+          <w:lang w:val="en-US"/>
+        </w:rPr>
+        <w:t xml:space="preserve"> you </w:t>
+      </w:r>
+      <w:r>
+        <w:rPr>
+          <w:lang w:val="en-US"/>
+        </w:rPr>
+        <w:t>are informed to</w:t>
+      </w:r>
+      <w:r>
+        <w:rPr>
+          <w:lang w:val="en-US"/>
+        </w:rPr>
+        <w:t xml:space="preserve"> edit the file /boot/firmware/setup.txt that contains information about passwords, WLAN setup parameter, temperature/humidity sensor to use and optional HMI di</w:t>
+      </w:r>
+      <w:r>
+        <w:rPr>
+          <w:lang w:val="en-US"/>
+        </w:rPr>
+        <w:t>splay</w:t>
+      </w:r>
+      <w:r>
+        <w:rPr>
+          <w:lang w:val="en-US"/>
+        </w:rPr>
+        <w:t xml:space="preserve"> version</w:t>
+      </w:r>
+      <w:r>
+        <w:rPr>
+          <w:lang w:val="en-US"/>
+        </w:rPr>
+        <w:t xml:space="preserve"> connected to your Pi-Ager:</w:t>
+      </w:r>
+    </w:p>
+    <w:p>
+      <w:pPr>
+        <w:pStyle w:val="Listenabsatz"/>
+        <w:rPr>
+          <w:lang w:val="en-US"/>
+        </w:rPr>
+      </w:pPr>
+    </w:p>
+    <w:p>
+      <w:pPr>
+        <w:pStyle w:val="Listenabsatz"/>
+        <w:rPr>
+          <w:lang w:val="en-US"/>
+        </w:rPr>
+      </w:pPr>
+      <w:proofErr w:type="spellStart"/>
+      <w:proofErr w:type="gramStart"/>
+      <w:r>
+        <w:rPr>
+          <w:color w:val="FF0000"/>
+          <w:lang w:val="en-US"/>
+        </w:rPr>
+        <w:t>sudo</w:t>
+      </w:r>
+      <w:proofErr w:type="spellEnd"/>
+      <w:proofErr w:type="gramEnd"/>
+      <w:r>
+        <w:rPr>
+          <w:color w:val="FF0000"/>
+          <w:lang w:val="en-US"/>
+        </w:rPr>
+        <w:t xml:space="preserve"> </w:t>
+      </w:r>
+      <w:proofErr w:type="spellStart"/>
+      <w:r>
+        <w:rPr>
+          <w:color w:val="FF0000"/>
+          <w:lang w:val="en-US"/>
+        </w:rPr>
+        <w:t>nano</w:t>
+      </w:r>
+      <w:proofErr w:type="spellEnd"/>
+      <w:r>
+        <w:rPr>
+          <w:color w:val="FF0000"/>
+          <w:lang w:val="en-US"/>
+        </w:rPr>
+        <w:t xml:space="preserve"> /boot/firmware/setup.txt</w:t>
+      </w:r>
+    </w:p>
+    <w:p>
+      <w:pPr>
+        <w:pStyle w:val="Listenabsatz"/>
+        <w:rPr>
+          <w:lang w:val="en-US"/>
+        </w:rPr>
+      </w:pPr>
+      <w:r>
+        <w:rPr>
+          <w:lang w:val="en-US"/>
+        </w:rPr>
+        <w:pict>
+          <v:shape id="_x0000_i1027" type="#_x0000_t75" style="width:453pt;height:348.75pt">
+            <v:imagedata r:id="rId22" o:title="putty3"/>
+          </v:shape>
+        </w:pict>
+      </w:r>
+    </w:p>
+    <w:p>
+      <w:pPr>
+        <w:pStyle w:val="Listenabsatz"/>
+        <w:rPr>
+          <w:lang w:val="en-US"/>
+        </w:rPr>
+      </w:pPr>
+    </w:p>
+    <w:p>
+      <w:pPr>
+        <w:pStyle w:val="Listenabsatz"/>
+        <w:rPr>
+          <w:lang w:val="en-US"/>
+        </w:rPr>
+      </w:pPr>
+      <w:r>
+        <w:rPr>
+          <w:lang w:val="en-US"/>
+        </w:rPr>
+        <w:t>After saving setup.txt the last step initializes the Pi-Ager system with data from setup.txt by starting the script pi-ager-finalize-build.sh:</w:t>
+      </w:r>
+    </w:p>
+    <w:p>
+      <w:pPr>
+        <w:pStyle w:val="Listenabsatz"/>
+        <w:rPr>
+          <w:lang w:val="en-US"/>
+        </w:rPr>
+      </w:pPr>
+    </w:p>
+    <w:p>
+      <w:pPr>
+        <w:pStyle w:val="Listenabsatz"/>
+        <w:rPr>
+          <w:color w:val="FF0000"/>
+          <w:lang w:val="en-US"/>
+        </w:rPr>
+      </w:pPr>
+      <w:proofErr w:type="spellStart"/>
+      <w:proofErr w:type="gramStart"/>
+      <w:r>
+        <w:rPr>
+          <w:color w:val="FF0000"/>
+          <w:lang w:val="en-US"/>
+        </w:rPr>
+        <w:t>sudo</w:t>
+      </w:r>
+      <w:proofErr w:type="spellEnd"/>
+      <w:proofErr w:type="gramEnd"/>
+      <w:r>
+        <w:rPr>
+          <w:color w:val="FF0000"/>
+          <w:lang w:val="en-US"/>
+        </w:rPr>
+        <w:t xml:space="preserve"> ./pi-ager-finalize-build.sh</w:t>
+      </w:r>
+    </w:p>
+    <w:p>
+      <w:pPr>
+        <w:pStyle w:val="Listenabsatz"/>
+        <w:rPr>
+          <w:lang w:val="en-US"/>
+        </w:rPr>
+      </w:pPr>
+    </w:p>
+    <w:p>
+      <w:pPr>
+        <w:pStyle w:val="Listenabsatz"/>
+        <w:rPr>
+          <w:lang w:val="en-US"/>
+        </w:rPr>
+      </w:pPr>
+      <w:r>
+        <w:rPr>
+          <w:lang w:val="en-US"/>
+        </w:rPr>
+        <w:t>The system is then rebooted and ready to start the Pi-Ager. Open your browser window and enter the IP-Address of the Pi-Ager</w:t>
+      </w:r>
+      <w:r>
+        <w:rPr>
+          <w:lang w:val="en-US"/>
+        </w:rPr>
+        <w:t xml:space="preserve"> </w:t>
+      </w:r>
+      <w:r>
+        <w:rPr>
+          <w:lang w:val="en-US"/>
+        </w:rPr>
+        <w:t>in the address line.</w:t>
+      </w:r>
       <w:bookmarkStart w:id="0" w:name="_GoBack"/>
       <w:bookmarkEnd w:id="0"/>
-      <w:r>
-        <w:rPr>
-          <w:rStyle w:val="Hyperlink"/>
-          <w:lang w:val="en-US"/>
-        </w:rPr>
-        <w:t>.sh</w:t>
-      </w:r>
-    </w:p>
-    <w:p>
-      <w:pPr>
-        <w:pStyle w:val="Listenabsatz"/>
-        <w:rPr>
-          <w:lang w:val="en-US"/>
-        </w:rPr>
-      </w:pPr>
-    </w:p>
-    <w:p>
-      <w:pPr>
-        <w:pStyle w:val="Listenabsatz"/>
-        <w:rPr>
-          <w:lang w:val="en-US"/>
-        </w:rPr>
-      </w:pPr>
-    </w:p>
-    <w:p>
-      <w:pPr>
-        <w:pStyle w:val="Listenabsatz"/>
-        <w:rPr>
-          <w:color w:val="FF0000"/>
-          <w:lang w:val="en-US"/>
-        </w:rPr>
-      </w:pPr>
-      <w:proofErr w:type="spellStart"/>
-      <w:proofErr w:type="gramStart"/>
-      <w:r>
-        <w:rPr>
-          <w:color w:val="FF0000"/>
-          <w:lang w:val="en-US"/>
-        </w:rPr>
-        <w:t>chmod</w:t>
-      </w:r>
-      <w:proofErr w:type="spellEnd"/>
-      <w:proofErr w:type="gramEnd"/>
-      <w:r>
-        <w:rPr>
-          <w:color w:val="FF0000"/>
-          <w:lang w:val="en-US"/>
-        </w:rPr>
-        <w:t xml:space="preserve"> +x *.</w:t>
-      </w:r>
-      <w:proofErr w:type="spellStart"/>
-      <w:r>
-        <w:rPr>
-          <w:color w:val="FF0000"/>
-          <w:lang w:val="en-US"/>
-        </w:rPr>
-        <w:t>sh</w:t>
-      </w:r>
-      <w:proofErr w:type="spellEnd"/>
-    </w:p>
-    <w:p>
-      <w:pPr>
-        <w:pStyle w:val="Listenabsatz"/>
-        <w:rPr>
-          <w:lang w:val="en-US"/>
-        </w:rPr>
-      </w:pPr>
-    </w:p>
-    <w:p>
-      <w:pPr>
-        <w:pStyle w:val="Listenabsatz"/>
-        <w:rPr>
-          <w:lang w:val="en-US"/>
-        </w:rPr>
-      </w:pPr>
-      <w:r>
-        <w:rPr>
-          <w:lang w:val="en-US"/>
-        </w:rPr>
-        <w:t>Start now first phase of Pi-Ager System setup:</w:t>
-      </w:r>
-    </w:p>
-    <w:p>
-      <w:pPr>
-        <w:pStyle w:val="Listenabsatz"/>
-        <w:rPr>
-          <w:color w:val="FF0000"/>
-          <w:lang w:val="en-US"/>
-        </w:rPr>
-      </w:pPr>
-      <w:proofErr w:type="spellStart"/>
-      <w:proofErr w:type="gramStart"/>
-      <w:r>
-        <w:rPr>
-          <w:color w:val="FF0000"/>
-          <w:lang w:val="en-US"/>
-        </w:rPr>
-        <w:t>sudo</w:t>
-      </w:r>
-      <w:proofErr w:type="spellEnd"/>
-      <w:proofErr w:type="gramEnd"/>
-      <w:r>
-        <w:rPr>
-          <w:color w:val="FF0000"/>
-          <w:lang w:val="en-US"/>
-        </w:rPr>
-        <w:t xml:space="preserve"> ./pi-ager-build-system.sh</w:t>
-      </w:r>
-    </w:p>
-    <w:p>
-      <w:pPr>
-        <w:pStyle w:val="Listenabsatz"/>
-        <w:rPr>
-          <w:color w:val="FF0000"/>
-          <w:lang w:val="en-US"/>
-        </w:rPr>
-      </w:pPr>
-    </w:p>
-    <w:p>
-      <w:pPr>
-        <w:pStyle w:val="Listenabsatz"/>
-        <w:rPr>
-          <w:lang w:val="en-US"/>
-        </w:rPr>
-      </w:pPr>
-      <w:r>
-        <w:rPr>
-          <w:lang w:val="en-US"/>
-        </w:rPr>
-        <w:t xml:space="preserve">You can now follow the system </w:t>
-      </w:r>
-      <w:proofErr w:type="gramStart"/>
-      <w:r>
-        <w:rPr>
-          <w:lang w:val="en-US"/>
-        </w:rPr>
-        <w:t>setup, that</w:t>
-      </w:r>
-      <w:proofErr w:type="gramEnd"/>
-      <w:r>
-        <w:rPr>
-          <w:lang w:val="en-US"/>
-        </w:rPr>
-        <w:t xml:space="preserve"> is divided in </w:t>
-      </w:r>
-      <w:r>
-        <w:rPr>
-          <w:lang w:val="en-US"/>
-        </w:rPr>
-        <w:t>3</w:t>
-      </w:r>
-      <w:r>
-        <w:rPr>
-          <w:lang w:val="en-US"/>
-        </w:rPr>
-        <w:t xml:space="preserve"> steps with rebooting between </w:t>
-      </w:r>
-      <w:r>
-        <w:rPr>
-          <w:lang w:val="en-US"/>
-        </w:rPr>
-        <w:t>the steps</w:t>
-      </w:r>
-      <w:r>
-        <w:rPr>
-          <w:lang w:val="en-US"/>
-        </w:rPr>
-        <w:t>. Restart</w:t>
-      </w:r>
-      <w:r>
-        <w:rPr>
-          <w:lang w:val="en-US"/>
-        </w:rPr>
-        <w:t xml:space="preserve"> the script </w:t>
-      </w:r>
-      <w:r>
-        <w:rPr>
-          <w:lang w:val="en-US"/>
-        </w:rPr>
-        <w:t xml:space="preserve">after rebooting to continue the system </w:t>
-      </w:r>
-      <w:proofErr w:type="gramStart"/>
-      <w:r>
-        <w:rPr>
-          <w:lang w:val="en-US"/>
-        </w:rPr>
-        <w:t>setup</w:t>
-      </w:r>
-      <w:r>
-        <w:rPr>
-          <w:lang w:val="en-US"/>
-        </w:rPr>
-        <w:t xml:space="preserve"> :</w:t>
-      </w:r>
-      <w:proofErr w:type="gramEnd"/>
-    </w:p>
-    <w:p>
-      <w:pPr>
-        <w:pStyle w:val="Listenabsatz"/>
-        <w:rPr>
-          <w:lang w:val="en-US"/>
-        </w:rPr>
-      </w:pPr>
-    </w:p>
-    <w:p>
-      <w:pPr>
-        <w:pStyle w:val="Listenabsatz"/>
-        <w:rPr>
-          <w:lang w:val="en-US"/>
-        </w:rPr>
-      </w:pPr>
-      <w:proofErr w:type="spellStart"/>
-      <w:proofErr w:type="gramStart"/>
-      <w:r>
-        <w:rPr>
-          <w:color w:val="FF0000"/>
-          <w:lang w:val="en-US"/>
-        </w:rPr>
-        <w:t>sudo</w:t>
-      </w:r>
-      <w:proofErr w:type="spellEnd"/>
-      <w:proofErr w:type="gramEnd"/>
-      <w:r>
-        <w:rPr>
-          <w:color w:val="FF0000"/>
-          <w:lang w:val="en-US"/>
-        </w:rPr>
-        <w:t xml:space="preserve"> ./pi-ager-build-system.sh</w:t>
-      </w:r>
-    </w:p>
-    <w:p>
-      <w:pPr>
-        <w:pStyle w:val="Listenabsatz"/>
-        <w:rPr>
-          <w:lang w:val="en-US"/>
-        </w:rPr>
-      </w:pPr>
-    </w:p>
-    <w:p>
-      <w:pPr>
-        <w:pStyle w:val="Listenabsatz"/>
-        <w:rPr>
-          <w:lang w:val="en-US"/>
-        </w:rPr>
-      </w:pPr>
-      <w:r>
-        <w:rPr>
-          <w:lang w:val="en-US"/>
-        </w:rPr>
-        <w:t xml:space="preserve">After step </w:t>
-      </w:r>
-      <w:r>
-        <w:rPr>
-          <w:lang w:val="en-US"/>
-        </w:rPr>
-        <w:t>2</w:t>
-      </w:r>
-      <w:r>
-        <w:rPr>
-          <w:lang w:val="en-US"/>
-        </w:rPr>
-        <w:t xml:space="preserve"> you </w:t>
-      </w:r>
-      <w:r>
-        <w:rPr>
-          <w:lang w:val="en-US"/>
-        </w:rPr>
-        <w:t>are informed to</w:t>
-      </w:r>
-      <w:r>
-        <w:rPr>
-          <w:lang w:val="en-US"/>
-        </w:rPr>
-        <w:t xml:space="preserve"> edit the file /boot/firmware/setup.txt that contains information about passwords, WLAN setup parameter, temperature/humidity sensor to use and optional HMI di</w:t>
-      </w:r>
-      <w:r>
-        <w:rPr>
-          <w:lang w:val="en-US"/>
-        </w:rPr>
-        <w:t>splay</w:t>
-      </w:r>
-      <w:r>
-        <w:rPr>
-          <w:lang w:val="en-US"/>
-        </w:rPr>
-        <w:t xml:space="preserve"> version</w:t>
-      </w:r>
-      <w:r>
-        <w:rPr>
-          <w:lang w:val="en-US"/>
-        </w:rPr>
-        <w:t xml:space="preserve"> connected to your Pi-Ager:</w:t>
-      </w:r>
-    </w:p>
-    <w:p>
-      <w:pPr>
-        <w:pStyle w:val="Listenabsatz"/>
-        <w:rPr>
-          <w:lang w:val="en-US"/>
-        </w:rPr>
-      </w:pPr>
-    </w:p>
-    <w:p>
-      <w:pPr>
-        <w:pStyle w:val="Listenabsatz"/>
-        <w:rPr>
-          <w:lang w:val="en-US"/>
-        </w:rPr>
-      </w:pPr>
-      <w:proofErr w:type="spellStart"/>
-      <w:proofErr w:type="gramStart"/>
-      <w:r>
-        <w:rPr>
-          <w:color w:val="FF0000"/>
-          <w:lang w:val="en-US"/>
-        </w:rPr>
-        <w:t>sudo</w:t>
-      </w:r>
-      <w:proofErr w:type="spellEnd"/>
-      <w:proofErr w:type="gramEnd"/>
-      <w:r>
-        <w:rPr>
-          <w:color w:val="FF0000"/>
-          <w:lang w:val="en-US"/>
-        </w:rPr>
-        <w:t xml:space="preserve"> </w:t>
-      </w:r>
-      <w:proofErr w:type="spellStart"/>
-      <w:r>
-        <w:rPr>
-          <w:color w:val="FF0000"/>
-          <w:lang w:val="en-US"/>
-        </w:rPr>
-        <w:t>nano</w:t>
-      </w:r>
-      <w:proofErr w:type="spellEnd"/>
-      <w:r>
-        <w:rPr>
-          <w:color w:val="FF0000"/>
-          <w:lang w:val="en-US"/>
-        </w:rPr>
-        <w:t xml:space="preserve"> /boot/firmware/setup.txt</w:t>
-      </w:r>
-    </w:p>
-    <w:p>
-      <w:pPr>
-        <w:pStyle w:val="Listenabsatz"/>
-        <w:rPr>
-          <w:lang w:val="en-US"/>
-        </w:rPr>
-      </w:pPr>
-      <w:r>
-        <w:rPr>
-          <w:lang w:val="en-US"/>
-        </w:rPr>
-        <w:lastRenderedPageBreak/>
-        <w:pict>
-          <v:shape id="_x0000_i1027" type="#_x0000_t75" style="width:453pt;height:348.75pt">
-            <v:imagedata r:id="rId23" o:title="putty3"/>
-          </v:shape>
-        </w:pict>
-      </w:r>
-    </w:p>
-    <w:p>
-      <w:pPr>
-        <w:pStyle w:val="Listenabsatz"/>
-        <w:rPr>
-          <w:lang w:val="en-US"/>
-        </w:rPr>
-      </w:pPr>
-    </w:p>
-    <w:p>
-      <w:pPr>
-        <w:pStyle w:val="Listenabsatz"/>
-        <w:rPr>
-          <w:lang w:val="en-US"/>
-        </w:rPr>
-      </w:pPr>
-      <w:r>
-        <w:rPr>
-          <w:lang w:val="en-US"/>
-        </w:rPr>
-        <w:t>After saving setup.txt the last step initializes the Pi-Ager system with data from setup.txt by starting the script pi-ager-finalize-build.sh:</w:t>
-      </w:r>
-    </w:p>
-    <w:p>
-      <w:pPr>
-        <w:pStyle w:val="Listenabsatz"/>
-        <w:rPr>
-          <w:lang w:val="en-US"/>
-        </w:rPr>
-      </w:pPr>
-    </w:p>
-    <w:p>
-      <w:pPr>
-        <w:pStyle w:val="Listenabsatz"/>
-        <w:rPr>
-          <w:color w:val="FF0000"/>
-          <w:lang w:val="en-US"/>
-        </w:rPr>
-      </w:pPr>
-      <w:proofErr w:type="spellStart"/>
-      <w:proofErr w:type="gramStart"/>
-      <w:r>
-        <w:rPr>
-          <w:color w:val="FF0000"/>
-          <w:lang w:val="en-US"/>
-        </w:rPr>
-        <w:t>sudo</w:t>
-      </w:r>
-      <w:proofErr w:type="spellEnd"/>
-      <w:proofErr w:type="gramEnd"/>
-      <w:r>
-        <w:rPr>
-          <w:color w:val="FF0000"/>
-          <w:lang w:val="en-US"/>
-        </w:rPr>
-        <w:t xml:space="preserve"> ./pi-ager-finalize-build.sh</w:t>
-      </w:r>
-    </w:p>
-    <w:p>
-      <w:pPr>
-        <w:pStyle w:val="Listenabsatz"/>
-        <w:rPr>
-          <w:lang w:val="en-US"/>
-        </w:rPr>
-      </w:pPr>
-    </w:p>
-    <w:p>
-      <w:pPr>
-        <w:pStyle w:val="Listenabsatz"/>
-        <w:rPr>
-          <w:lang w:val="en-US"/>
-        </w:rPr>
-      </w:pPr>
-      <w:r>
-        <w:rPr>
-          <w:lang w:val="en-US"/>
-        </w:rPr>
-        <w:t>The system is then rebooted and ready to start the Pi-Ager. Open your browser window and enter the IP-Address of the Pi-Ager</w:t>
-      </w:r>
-      <w:r>
-        <w:rPr>
-          <w:lang w:val="en-US"/>
-        </w:rPr>
-        <w:t xml:space="preserve"> </w:t>
-      </w:r>
-      <w:r>
-        <w:rPr>
-          <w:lang w:val="en-US"/>
-        </w:rPr>
-        <w:t>in the address line.</w:t>
-      </w:r>
-    </w:p>
-    <w:p>
-      <w:pPr>
-        <w:pStyle w:val="Listenabsatz"/>
-        <w:numPr>
-          <w:ilvl w:val="0"/>
-          <w:numId w:val="1"/>
-        </w:numPr>
-        <w:rPr>
-          <w:lang w:val="en-US"/>
-        </w:rPr>
-      </w:pPr>
       <w:r>
         <w:rPr>
           <w:lang w:val="en-US"/>
@@ -2516,7 +2383,7 @@
           <w:lang w:val="en-US"/>
         </w:rPr>
       </w:pPr>
-      <w:hyperlink r:id="rId24" w:history="1">
+      <w:hyperlink r:id="rId23" w:history="1">
         <w:r>
           <w:rPr>
             <w:rStyle w:val="Hyperlink"/>
@@ -2580,7 +2447,7 @@
                     <pic:cNvPicPr/>
                   </pic:nvPicPr>
                   <pic:blipFill>
-                    <a:blip r:embed="rId25"/>
+                    <a:blip r:embed="rId24"/>
                     <a:stretch>
                       <a:fillRect/>
                     </a:stretch>
@@ -2686,7 +2553,7 @@
                     <pic:cNvPicPr/>
                   </pic:nvPicPr>
                   <pic:blipFill>
-                    <a:blip r:embed="rId26"/>
+                    <a:blip r:embed="rId25"/>
                     <a:stretch>
                       <a:fillRect/>
                     </a:stretch>

</xml_diff>

<commit_message>
Pi-Ager support for Raspberry Pi 3B+ added.
</commit_message>
<xml_diff>
--- a/anleitungen/pi-ager-basic-install_rev7.docx
+++ b/anleitungen/pi-ager-basic-install_rev7.docx
@@ -50,7 +50,19 @@
         <w:rPr>
           <w:lang w:val="en-US"/>
         </w:rPr>
-        <w:t>Pi 3/</w:t>
+        <w:t>Pi 3</w:t>
+      </w:r>
+      <w:r>
+        <w:rPr>
+          <w:lang w:val="en-US"/>
+        </w:rPr>
+        <w:t>B+</w:t>
+      </w:r>
+      <w:r>
+        <w:rPr>
+          <w:lang w:val="en-US"/>
+        </w:rPr>
+        <w:t>/</w:t>
       </w:r>
       <w:r>
         <w:rPr>
@@ -150,6 +162,14 @@
         </w:rPr>
         <w:t>rixie</w:t>
       </w:r>
+      <w:r>
+        <w:rPr>
+          <w:lang w:val="en-US"/>
+        </w:rPr>
+        <w:t xml:space="preserve"> 32Bit and 64Bit</w:t>
+      </w:r>
+      <w:bookmarkStart w:id="0" w:name="_GoBack"/>
+      <w:bookmarkEnd w:id="0"/>
     </w:p>
     <w:p>
       <w:pPr>
@@ -2233,8 +2253,6 @@
         </w:rPr>
         <w:t>in the address line.</w:t>
       </w:r>
-      <w:bookmarkStart w:id="0" w:name="_GoBack"/>
-      <w:bookmarkEnd w:id="0"/>
       <w:r>
         <w:rPr>
           <w:lang w:val="en-US"/>

</xml_diff>